<commit_message>
fix: harden Deep Agent v0.8.0 concurrency and input limits
</commit_message>
<xml_diff>
--- a/user-docs/DeepSeek-Agent-V3-使用说明-0.8.0.docx
+++ b/user-docs/DeepSeek-Agent-V3-使用说明-0.8.0.docx
@@ -2396,6 +2396,39 @@
         <w:rPr>
           <w:rStyle w:val="FunctionTok"/>
         </w:rPr>
+        <w:t xml:space="preserve">progress_interval_seconds</w:t>
+      </w:r>
+      <w:r>
+        <w:rPr>
+          <w:rStyle w:val="KeywordTok"/>
+        </w:rPr>
+        <w:t xml:space="preserve">:</w:t>
+      </w:r>
+      <w:r>
+        <w:rPr>
+          <w:rStyle w:val="AttributeTok"/>
+        </w:rPr>
+        <w:t xml:space="preserve"> </w:t>
+      </w:r>
+      <w:r>
+        <w:rPr>
+          <w:rStyle w:val="DecValTok"/>
+        </w:rPr>
+        <w:t xml:space="preserve">10</w:t>
+      </w:r>
+      <w:r>
+        <w:br/>
+      </w:r>
+      <w:r>
+        <w:rPr>
+          <w:rStyle w:val="AttributeTok"/>
+        </w:rPr>
+        <w:t xml:space="preserve">  </w:t>
+      </w:r>
+      <w:r>
+        <w:rPr>
+          <w:rStyle w:val="FunctionTok"/>
+        </w:rPr>
         <w:t xml:space="preserve">show_thinking</w:t>
       </w:r>
       <w:r>
@@ -2420,12 +2453,45 @@
         <w:br/>
       </w:r>
       <w:r>
-        <w:br/>
+        <w:rPr>
+          <w:rStyle w:val="AttributeTok"/>
+        </w:rPr>
+        <w:t xml:space="preserve">  </w:t>
       </w:r>
       <w:r>
         <w:rPr>
           <w:rStyle w:val="FunctionTok"/>
         </w:rPr>
+        <w:t xml:space="preserve">show_reasoning_content</w:t>
+      </w:r>
+      <w:r>
+        <w:rPr>
+          <w:rStyle w:val="KeywordTok"/>
+        </w:rPr>
+        <w:t xml:space="preserve">:</w:t>
+      </w:r>
+      <w:r>
+        <w:rPr>
+          <w:rStyle w:val="AttributeTok"/>
+        </w:rPr>
+        <w:t xml:space="preserve"> </w:t>
+      </w:r>
+      <w:r>
+        <w:rPr>
+          <w:rStyle w:val="CharTok"/>
+        </w:rPr>
+        <w:t xml:space="preserve">true</w:t>
+      </w:r>
+      <w:r>
+        <w:br/>
+      </w:r>
+      <w:r>
+        <w:br/>
+      </w:r>
+      <w:r>
+        <w:rPr>
+          <w:rStyle w:val="FunctionTok"/>
+        </w:rPr>
         <w:t xml:space="preserve">model</w:t>
       </w:r>
       <w:r>
@@ -2603,6 +2669,172 @@
       </w:r>
       <w:r>
         <w:t xml:space="preserve"> Key。</w:t>
+      </w:r>
+    </w:p>
+    <w:p>
+      <w:pPr>
+        <w:pStyle w:val="BodyText"/>
+      </w:pPr>
+      <w:r>
+        <w:rPr>
+          <w:rFonts w:hint="eastAsia"/>
+        </w:rPr>
+        <w:t xml:space="preserve">并发和输入边界也已加固：首次</w:t>
+      </w:r>
+      <w:r>
+        <w:t xml:space="preserve"> Project </w:t>
+      </w:r>
+      <w:r>
+        <w:rPr>
+          <w:rFonts w:hint="eastAsia"/>
+        </w:rPr>
+        <w:t xml:space="preserve">初始化使用项目锁，同一</w:t>
+      </w:r>
+      <w:r>
+        <w:t xml:space="preserve"> Session </w:t>
+      </w:r>
+      <w:r>
+        <w:rPr>
+          <w:rFonts w:hint="eastAsia"/>
+        </w:rPr>
+        <w:t xml:space="preserve">不能被两个进程同时</w:t>
+      </w:r>
+      <w:r>
+        <w:t xml:space="preserve"> </w:t>
+      </w:r>
+      <w:r>
+        <w:rPr>
+          <w:rFonts w:hint="eastAsia"/>
+        </w:rPr>
+        <w:t xml:space="preserve">Resume，Context/Workspace</w:t>
+      </w:r>
+      <w:r>
+        <w:t xml:space="preserve"> </w:t>
+      </w:r>
+      <w:r>
+        <w:rPr>
+          <w:rFonts w:hint="eastAsia"/>
+        </w:rPr>
+        <w:t xml:space="preserve">缓存原子写入；Daemon</w:t>
+      </w:r>
+      <w:r>
+        <w:t xml:space="preserve"> </w:t>
+      </w:r>
+      <w:r>
+        <w:rPr>
+          <w:rFonts w:hint="eastAsia"/>
+        </w:rPr>
+        <w:t xml:space="preserve">精确校验</w:t>
+      </w:r>
+      <w:r>
+        <w:t xml:space="preserve"> argv </w:t>
+      </w:r>
+      <w:r>
+        <w:rPr>
+          <w:rFonts w:hint="eastAsia"/>
+        </w:rPr>
+        <w:t xml:space="preserve">与进程</w:t>
+      </w:r>
+      <w:r>
+        <w:t xml:space="preserve"> </w:t>
+      </w:r>
+      <w:r>
+        <w:rPr>
+          <w:rFonts w:hint="eastAsia"/>
+        </w:rPr>
+        <w:t xml:space="preserve">starttime，Queue</w:t>
+      </w:r>
+      <w:r>
+        <w:t xml:space="preserve"> </w:t>
+      </w:r>
+      <w:r>
+        <w:rPr>
+          <w:rFonts w:hint="eastAsia"/>
+        </w:rPr>
+        <w:t xml:space="preserve">超时清理整个进程组；Shell</w:t>
+      </w:r>
+      <w:r>
+        <w:t xml:space="preserve"> </w:t>
+      </w:r>
+      <w:r>
+        <w:rPr>
+          <w:rFonts w:hint="eastAsia"/>
+        </w:rPr>
+        <w:t xml:space="preserve">输出、HTTP</w:t>
+      </w:r>
+      <w:r>
+        <w:t xml:space="preserve"> </w:t>
+      </w:r>
+      <w:r>
+        <w:rPr>
+          <w:rFonts w:hint="eastAsia"/>
+        </w:rPr>
+        <w:t xml:space="preserve">请求体/Header、文档输入、浏览器下载和</w:t>
+      </w:r>
+      <w:r>
+        <w:t xml:space="preserve"> MCP </w:t>
+      </w:r>
+      <w:r>
+        <w:rPr>
+          <w:rFonts w:hint="eastAsia"/>
+        </w:rPr>
+        <w:t xml:space="preserve">分页都有硬上限。</w:t>
+      </w:r>
+    </w:p>
+    <w:p>
+      <w:pPr>
+        <w:pStyle w:val="BodyText"/>
+      </w:pPr>
+      <w:r>
+        <w:rPr>
+          <w:rFonts w:hint="eastAsia"/>
+        </w:rPr>
+        <w:t xml:space="preserve">注意：普通/YOLO</w:t>
+      </w:r>
+      <w:r>
+        <w:t xml:space="preserve"> </w:t>
+      </w:r>
+      <w:r>
+        <w:rPr>
+          <w:rFonts w:hint="eastAsia"/>
+        </w:rPr>
+        <w:t xml:space="preserve">的</w:t>
+      </w:r>
+      <w:r>
+        <w:t xml:space="preserve"> Docker </w:t>
+      </w:r>
+      <w:r>
+        <w:rPr>
+          <w:rFonts w:hint="eastAsia"/>
+        </w:rPr>
+        <w:t xml:space="preserve">会拒绝</w:t>
+      </w:r>
+      <w:r>
+        <w:t xml:space="preserve"> host root/socket/device/namespace。Shell/Python </w:t>
+      </w:r>
+      <w:r>
+        <w:rPr>
+          <w:rFonts w:hint="eastAsia"/>
+        </w:rPr>
+        <w:t xml:space="preserve">仍是宿主机进程，程序能限制请求里的工作目录并拦截已知危险模式，但命令文本内部的绝对路径最终由</w:t>
+      </w:r>
+      <w:r>
+        <w:t xml:space="preserve"> Linux </w:t>
+      </w:r>
+      <w:r>
+        <w:rPr>
+          <w:rFonts w:hint="eastAsia"/>
+        </w:rPr>
+        <w:t xml:space="preserve">权限而非项目级</w:t>
+      </w:r>
+      <w:r>
+        <w:t xml:space="preserve"> OS </w:t>
+      </w:r>
+      <w:r>
+        <w:rPr>
+          <w:rFonts w:hint="eastAsia"/>
+        </w:rPr>
+        <w:t xml:space="preserve">沙箱隔离。处理不可信任务时使用默认安全模式。</w:t>
       </w:r>
     </w:p>
     <w:bookmarkEnd w:id="16"/>

</xml_diff>